<commit_message>
docs: sync project docs with final dossier and add evaluation details
</commit_message>
<xml_diff>
--- a/Group_10_Devraj_Aaryesh_Jiya/docs/IVRAR_Group_10_Technical_Dossier.docx
+++ b/Group_10_Devraj_Aaryesh_Jiya/docs/IVRAR_Group_10_Technical_Dossier.docx
@@ -1920,7 +1920,7 @@
                     <w:sz w:val="14"/>
                     <w:szCs w:val="14"/>
                   </w:rPr>
-                  <w:t>Shared</w:t>
+                  <w:t>R014</w:t>
                 </w:r>
               </w:sdtContent>
             </w:sdt>
@@ -2032,7 +2032,7 @@
                     <w:sz w:val="14"/>
                     <w:szCs w:val="14"/>
                   </w:rPr>
-                  <w:t>Shared</w:t>
+                  <w:t>R054</w:t>
                 </w:r>
               </w:sdtContent>
             </w:sdt>
@@ -2274,7 +2274,7 @@
                     <w:sz w:val="14"/>
                     <w:szCs w:val="14"/>
                   </w:rPr>
-                  <w:t>R045</w:t>
+                  <w:t>Shared</w:t>
                 </w:r>
               </w:sdtContent>
             </w:sdt>
@@ -2923,7 +2923,7 @@
                     <w:sz w:val="15"/>
                     <w:szCs w:val="15"/>
                   </w:rPr>
-                  <w:t>type here</w:t>
+                  <w:t>03c7d14b492c8c971ec65694eda705cf333b0931</w:t>
                 </w:r>
               </w:sdtContent>
             </w:sdt>
@@ -2964,6 +2964,7 @@
             <w:sdt>
               <w:sdtPr>
                 <w:rPr>
+                  <w:rStyle w:val="Hyperlink"/>
                   <w:sz w:val="15"/>
                   <w:szCs w:val="15"/>
                 </w:rPr>
@@ -2975,10 +2976,11 @@
               <w:sdtContent>
                 <w:r>
                   <w:rPr>
+                    <w:rStyle w:val="Hyperlink"/>
                     <w:sz w:val="15"/>
                     <w:szCs w:val="15"/>
                   </w:rPr>
-                  <w:t>type here</w:t>
+                  <w:t>https://github.com/Aaryupat10/NMIMS-MPSTME-IVRAR-2026/releases/tag/group-10-v1.0</w:t>
                 </w:r>
               </w:sdtContent>
             </w:sdt>
@@ -3037,7 +3039,7 @@
                     <w:sz w:val="15"/>
                     <w:szCs w:val="15"/>
                   </w:rPr>
-                  <w:t>Select ▾</w:t>
+                  <w:t>Yes</w:t>
                 </w:r>
               </w:sdtContent>
             </w:sdt>
@@ -3096,7 +3098,7 @@
                     <w:sz w:val="15"/>
                     <w:szCs w:val="15"/>
                   </w:rPr>
-                  <w:t>Select ▾</w:t>
+                  <w:t>Yes</w:t>
                 </w:r>
               </w:sdtContent>
             </w:sdt>
@@ -3155,7 +3157,7 @@
                     <w:sz w:val="15"/>
                     <w:szCs w:val="15"/>
                   </w:rPr>
-                  <w:t>Select ▾</w:t>
+                  <w:t>Yes</w:t>
                 </w:r>
               </w:sdtContent>
             </w:sdt>
@@ -3214,7 +3216,7 @@
                     <w:sz w:val="15"/>
                     <w:szCs w:val="15"/>
                   </w:rPr>
-                  <w:t>Select ▾</w:t>
+                  <w:t>Yes</w:t>
                 </w:r>
               </w:sdtContent>
             </w:sdt>
@@ -3267,7 +3269,7 @@
                     <w:sz w:val="15"/>
                     <w:szCs w:val="15"/>
                   </w:rPr>
-                  <w:t>Select ▾</w:t>
+                  <w:t>Yes</w:t>
                 </w:r>
               </w:sdtContent>
             </w:sdt>
@@ -3429,7 +3431,7 @@
                     <w:sz w:val="15"/>
                     <w:szCs w:val="15"/>
                   </w:rPr>
-                  <w:t>type here</w:t>
+                  <w:t>14</w:t>
                 </w:r>
               </w:sdtContent>
             </w:sdt>
@@ -3499,7 +3501,7 @@
                     <w:sz w:val="15"/>
                     <w:szCs w:val="15"/>
                   </w:rPr>
-                  <w:t>type here</w:t>
+                  <w:t>origin/feat/r045-final-submission  origin/feat/r045-xr-systems-architect</w:t>
                 </w:r>
               </w:sdtContent>
             </w:sdt>
@@ -3569,7 +3571,7 @@
                     <w:sz w:val="15"/>
                     <w:szCs w:val="15"/>
                   </w:rPr>
-                  <w:t>type here</w:t>
+                  <w:t>3526</w:t>
                 </w:r>
               </w:sdtContent>
             </w:sdt>
@@ -3639,7 +3641,7 @@
                     <w:sz w:val="15"/>
                     <w:szCs w:val="15"/>
                   </w:rPr>
-                  <w:t>type here</w:t>
+                  <w:t>18.8</w:t>
                 </w:r>
               </w:sdtContent>
             </w:sdt>
@@ -3709,7 +3711,7 @@
                     <w:sz w:val="15"/>
                     <w:szCs w:val="15"/>
                   </w:rPr>
-                  <w:t>type here</w:t>
+                  <w:t>24</w:t>
                 </w:r>
               </w:sdtContent>
             </w:sdt>
@@ -3770,7 +3772,7 @@
                     <w:sz w:val="15"/>
                     <w:szCs w:val="15"/>
                   </w:rPr>
-                  <w:t>type here</w:t>
+                  <w:t>SIMULATED_hand_tracking_benchmark.csvSIMULATED_sample_experiment_data.csv</w:t>
                 </w:r>
               </w:sdtContent>
             </w:sdt>
@@ -3952,7 +3954,7 @@
                     <w:sz w:val="15"/>
                     <w:szCs w:val="15"/>
                   </w:rPr>
-                  <w:t>type here</w:t>
+                  <w:t>devraj2712</w:t>
                 </w:r>
               </w:sdtContent>
             </w:sdt>
@@ -3983,7 +3985,7 @@
                     <w:sz w:val="15"/>
                     <w:szCs w:val="15"/>
                   </w:rPr>
-                  <w:t>type here</w:t>
+                  <w:t>0</w:t>
                 </w:r>
               </w:sdtContent>
             </w:sdt>
@@ -4014,7 +4016,7 @@
                     <w:sz w:val="15"/>
                     <w:szCs w:val="15"/>
                   </w:rPr>
-                  <w:t>type here</w:t>
+                  <w:t>33</w:t>
                 </w:r>
               </w:sdtContent>
             </w:sdt>
@@ -4129,7 +4131,7 @@
                     <w:sz w:val="15"/>
                     <w:szCs w:val="15"/>
                   </w:rPr>
-                  <w:t>type here</w:t>
+                  <w:t>3</w:t>
                 </w:r>
               </w:sdtContent>
             </w:sdt>
@@ -4160,7 +4162,7 @@
                     <w:sz w:val="15"/>
                     <w:szCs w:val="15"/>
                   </w:rPr>
-                  <w:t>type here</w:t>
+                  <w:t>34</w:t>
                 </w:r>
               </w:sdtContent>
             </w:sdt>
@@ -4238,7 +4240,7 @@
                     <w:sz w:val="15"/>
                     <w:szCs w:val="15"/>
                   </w:rPr>
-                  <w:t>type here</w:t>
+                  <w:t>JiyaSaxena</w:t>
                 </w:r>
               </w:sdtContent>
             </w:sdt>
@@ -4266,7 +4268,7 @@
                     <w:sz w:val="15"/>
                     <w:szCs w:val="15"/>
                   </w:rPr>
-                  <w:t>type here</w:t>
+                  <w:t>1</w:t>
                 </w:r>
               </w:sdtContent>
             </w:sdt>
@@ -4294,7 +4296,7 @@
                     <w:sz w:val="15"/>
                     <w:szCs w:val="15"/>
                   </w:rPr>
-                  <w:t>type here</w:t>
+                  <w:t>33</w:t>
                 </w:r>
               </w:sdtContent>
             </w:sdt>
@@ -4590,7 +4592,7 @@
                     <w:sz w:val="15"/>
                     <w:szCs w:val="15"/>
                   </w:rPr>
-                  <w:t>type here</w:t>
+                  <w:t>10</w:t>
                 </w:r>
               </w:sdtContent>
             </w:sdt>
@@ -4650,7 +4652,7 @@
                     <w:sz w:val="15"/>
                     <w:szCs w:val="15"/>
                   </w:rPr>
-                  <w:t>Select ▾</w:t>
+                  <w:t>Within-subjects (everyone tries both)</w:t>
                 </w:r>
               </w:sdtContent>
             </w:sdt>
@@ -4705,7 +4707,7 @@
                     <w:sz w:val="15"/>
                     <w:szCs w:val="15"/>
                   </w:rPr>
-                  <w:t>type here</w:t>
+                  <w:t>27/10/2026 at AR/VR Lab</w:t>
                 </w:r>
               </w:sdtContent>
             </w:sdt>
@@ -4749,13 +4751,27 @@
                 <w:text/>
               </w:sdtPr>
               <w:sdtContent>
-                <w:r>
-                  <w:rPr>
-                    <w:sz w:val="15"/>
-                    <w:szCs w:val="15"/>
-                  </w:rPr>
-                  <w:t>type here</w:t>
-                </w:r>
+                <w:sdt>
+                  <w:sdtPr>
+                    <w:rPr>
+                      <w:sz w:val="15"/>
+                      <w:szCs w:val="15"/>
+                    </w:rPr>
+                    <w:alias w:val="G10.S4.raw_csv_path"/>
+                    <w:tag w:val="G10.S4.raw_csv_path"/>
+                    <w:id w:val="1367415647"/>
+                    <w:text/>
+                  </w:sdtPr>
+                  <w:sdtContent>
+                    <w:r>
+                      <w:rPr>
+                        <w:sz w:val="15"/>
+                        <w:szCs w:val="15"/>
+                      </w:rPr>
+                      <w:t>Only videos of 10 persons testing have been recorded; trial logger needs a keyboard, not available on the Quest build</w:t>
+                    </w:r>
+                  </w:sdtContent>
+                </w:sdt>
               </w:sdtContent>
             </w:sdt>
           </w:p>
@@ -5753,6 +5769,7 @@
           <w:b/>
           <w:sz w:val="22"/>
         </w:rPr>
+        <w:lastRenderedPageBreak/>
         <w:t>SECTION 5 · LinkedIn Video Showcase, AI Verification Audit &amp; Peer Review</w:t>
       </w:r>
       <w:r>
@@ -5953,7 +5970,6 @@
         <w:rPr>
           <w:b/>
         </w:rPr>
-        <w:lastRenderedPageBreak/>
         <w:t>5.1 AI Interaction Audit Log: three cases where AI was wrong, made something up, or was unverifiable</w:t>
       </w:r>
     </w:p>
@@ -7763,7 +7779,7 @@
                     <w:sz w:val="14"/>
                     <w:szCs w:val="14"/>
                   </w:rPr>
-                  <w:t>type here</w:t>
+                  <w:t>24</w:t>
                 </w:r>
               </w:sdtContent>
             </w:sdt>
@@ -7801,7 +7817,7 @@
                     <w:sz w:val="14"/>
                     <w:szCs w:val="14"/>
                   </w:rPr>
-                  <w:t>Select ▾</w:t>
+                  <w:t>5</w:t>
                 </w:r>
               </w:sdtContent>
             </w:sdt>
@@ -7837,7 +7853,7 @@
                     <w:sz w:val="14"/>
                     <w:szCs w:val="14"/>
                   </w:rPr>
-                  <w:t>Select ▾</w:t>
+                  <w:t>Git only</w:t>
                 </w:r>
               </w:sdtContent>
             </w:sdt>
@@ -7872,7 +7888,7 @@
                     <w:sz w:val="14"/>
                     <w:szCs w:val="14"/>
                   </w:rPr>
-                  <w:t>Select ▾</w:t>
+                  <w:t>No</w:t>
                 </w:r>
               </w:sdtContent>
             </w:sdt>
@@ -7907,7 +7923,7 @@
                     <w:sz w:val="14"/>
                     <w:szCs w:val="14"/>
                   </w:rPr>
-                  <w:t>Select ▾</w:t>
+                  <w:t>No</w:t>
                 </w:r>
               </w:sdtContent>
             </w:sdt>
@@ -7944,7 +7960,7 @@
                     <w:sz w:val="14"/>
                     <w:szCs w:val="14"/>
                   </w:rPr>
-                  <w:t>Select ▾</w:t>
+                  <w:t>26–50 %</w:t>
                 </w:r>
               </w:sdtContent>
             </w:sdt>
@@ -7981,7 +7997,7 @@
                     <w:sz w:val="14"/>
                     <w:szCs w:val="14"/>
                   </w:rPr>
-                  <w:t>Select ▾</w:t>
+                  <w:t>1–2</w:t>
                 </w:r>
               </w:sdtContent>
             </w:sdt>
@@ -8035,7 +8051,7 @@
                     <w:sz w:val="14"/>
                     <w:szCs w:val="14"/>
                   </w:rPr>
-                  <w:t>type here</w:t>
+                  <w:t>30</w:t>
                 </w:r>
               </w:sdtContent>
             </w:sdt>
@@ -8073,7 +8089,7 @@
                     <w:sz w:val="14"/>
                     <w:szCs w:val="14"/>
                   </w:rPr>
-                  <w:t>Select ▾</w:t>
+                  <w:t>5</w:t>
                 </w:r>
               </w:sdtContent>
             </w:sdt>
@@ -8109,7 +8125,7 @@
                     <w:sz w:val="14"/>
                     <w:szCs w:val="14"/>
                   </w:rPr>
-                  <w:t>Select ▾</w:t>
+                  <w:t>Git only</w:t>
                 </w:r>
               </w:sdtContent>
             </w:sdt>
@@ -8144,7 +8160,7 @@
                     <w:sz w:val="14"/>
                     <w:szCs w:val="14"/>
                   </w:rPr>
-                  <w:t>Select ▾</w:t>
+                  <w:t>No</w:t>
                 </w:r>
               </w:sdtContent>
             </w:sdt>
@@ -8179,7 +8195,7 @@
                     <w:sz w:val="14"/>
                     <w:szCs w:val="14"/>
                   </w:rPr>
-                  <w:t>Select ▾</w:t>
+                  <w:t>No</w:t>
                 </w:r>
               </w:sdtContent>
             </w:sdt>
@@ -8216,7 +8232,7 @@
                     <w:sz w:val="14"/>
                     <w:szCs w:val="14"/>
                   </w:rPr>
-                  <w:t>Select ▾</w:t>
+                  <w:t>26–50 %</w:t>
                 </w:r>
               </w:sdtContent>
             </w:sdt>
@@ -8253,7 +8269,7 @@
                     <w:sz w:val="14"/>
                     <w:szCs w:val="14"/>
                   </w:rPr>
-                  <w:t>Select ▾</w:t>
+                  <w:t>3–5</w:t>
                 </w:r>
               </w:sdtContent>
             </w:sdt>
@@ -8284,27 +8300,13 @@
             <w:tcW w:w="850" w:type="dxa"/>
           </w:tcPr>
           <w:p>
-            <w:sdt>
-              <w:sdtPr>
-                <w:rPr>
-                  <w:sz w:val="14"/>
-                  <w:szCs w:val="14"/>
-                </w:rPr>
-                <w:alias w:val="G10.S6.R054.hours"/>
-                <w:tag w:val="G10.S6.R054.hours"/>
-                <w:id w:val="-1787725770"/>
-                <w:text/>
-              </w:sdtPr>
-              <w:sdtContent>
-                <w:r>
-                  <w:rPr>
-                    <w:sz w:val="14"/>
-                    <w:szCs w:val="14"/>
-                  </w:rPr>
-                  <w:t>type here</w:t>
-                </w:r>
-              </w:sdtContent>
-            </w:sdt>
+            <w:r>
+              <w:rPr>
+                <w:sz w:val="14"/>
+                <w:szCs w:val="14"/>
+              </w:rPr>
+              <w:t>27</w:t>
+            </w:r>
           </w:p>
         </w:tc>
         <w:tc>
@@ -8336,7 +8338,7 @@
                     <w:sz w:val="14"/>
                     <w:szCs w:val="14"/>
                   </w:rPr>
-                  <w:t>Select ▾</w:t>
+                  <w:t>5</w:t>
                 </w:r>
               </w:sdtContent>
             </w:sdt>
@@ -8369,7 +8371,7 @@
                     <w:sz w:val="14"/>
                     <w:szCs w:val="14"/>
                   </w:rPr>
-                  <w:t>Select ▾</w:t>
+                  <w:t>Git only</w:t>
                 </w:r>
               </w:sdtContent>
             </w:sdt>
@@ -8401,7 +8403,7 @@
                     <w:sz w:val="14"/>
                     <w:szCs w:val="14"/>
                   </w:rPr>
-                  <w:t>Select ▾</w:t>
+                  <w:t>No</w:t>
                 </w:r>
               </w:sdtContent>
             </w:sdt>
@@ -8433,7 +8435,7 @@
                     <w:sz w:val="14"/>
                     <w:szCs w:val="14"/>
                   </w:rPr>
-                  <w:t>Select ▾</w:t>
+                  <w:t>No</w:t>
                 </w:r>
               </w:sdtContent>
             </w:sdt>
@@ -8467,7 +8469,7 @@
                     <w:sz w:val="14"/>
                     <w:szCs w:val="14"/>
                   </w:rPr>
-                  <w:t>Select ▾</w:t>
+                  <w:t>26–50 %</w:t>
                 </w:r>
               </w:sdtContent>
             </w:sdt>
@@ -8501,7 +8503,7 @@
                     <w:sz w:val="14"/>
                     <w:szCs w:val="14"/>
                   </w:rPr>
-                  <w:t>Select ▾</w:t>
+                  <w:t>6 or more</w:t>
                 </w:r>
               </w:sdtContent>
             </w:sdt>
@@ -8634,7 +8636,7 @@
                     <w:sz w:val="14"/>
                     <w:szCs w:val="14"/>
                   </w:rPr>
-                  <w:t>type here</w:t>
+                  <w:t>How a webcam hand-tracking pipeline works end to end, from MediaPipe landmarks to streaming over UDP into Unity.</w:t>
                 </w:r>
               </w:sdtContent>
             </w:sdt>
@@ -8648,27 +8650,13 @@
             <w:pPr>
               <w:keepNext/>
             </w:pPr>
-            <w:sdt>
-              <w:sdtPr>
-                <w:rPr>
-                  <w:sz w:val="14"/>
-                  <w:szCs w:val="14"/>
-                </w:rPr>
-                <w:alias w:val="G10.S6.R014.change_one_thing"/>
-                <w:tag w:val="G10.S6.R014.change_one_thing"/>
-                <w:id w:val="17428273"/>
-                <w:text/>
-              </w:sdtPr>
-              <w:sdtContent>
-                <w:r>
-                  <w:rPr>
-                    <w:sz w:val="14"/>
-                    <w:szCs w:val="14"/>
-                  </w:rPr>
-                  <w:t>type here</w:t>
-                </w:r>
-              </w:sdtContent>
-            </w:sdt>
+            <w:r>
+              <w:rPr>
+                <w:sz w:val="14"/>
+                <w:szCs w:val="14"/>
+              </w:rPr>
+              <w:t>-</w:t>
+            </w:r>
           </w:p>
         </w:tc>
       </w:tr>
@@ -8719,7 +8707,14 @@
                     <w:sz w:val="14"/>
                     <w:szCs w:val="14"/>
                   </w:rPr>
-                  <w:t>type here</w:t>
+                  <w:t>Hand tracking that looks simple in a demo needs a lot of hidden work: filtering jitter, tuning gesture thresholds, and keeping latency low enough to feel natural in a headset</w:t>
+                </w:r>
+                <w:r>
+                  <w:rPr>
+                    <w:sz w:val="14"/>
+                    <w:szCs w:val="14"/>
+                  </w:rPr>
+                  <w:t>.</w:t>
                 </w:r>
               </w:sdtContent>
             </w:sdt>
@@ -8750,7 +8745,7 @@
                     <w:sz w:val="14"/>
                     <w:szCs w:val="14"/>
                   </w:rPr>
-                  <w:t>type here</w:t>
+                  <w:t>-</w:t>
                 </w:r>
               </w:sdtContent>
             </w:sdt>
@@ -8783,10 +8778,6 @@
           <w:p>
             <w:sdt>
               <w:sdtPr>
-                <w:rPr>
-                  <w:sz w:val="14"/>
-                  <w:szCs w:val="14"/>
-                </w:rPr>
                 <w:alias w:val="G10.S6.R054.most_valuable"/>
                 <w:tag w:val="G10.S6.R054.most_valuable"/>
                 <w:id w:val="1998757726"/>
@@ -8794,11 +8785,7 @@
               </w:sdtPr>
               <w:sdtContent>
                 <w:r>
-                  <w:rPr>
-                    <w:sz w:val="14"/>
-                    <w:szCs w:val="14"/>
-                  </w:rPr>
-                  <w:t>type here</w:t>
+                  <w:t>Reliable gesture recognition depends on normalised thresholds and debouncing, not just detecting a pose once.</w:t>
                 </w:r>
               </w:sdtContent>
             </w:sdt>
@@ -8826,7 +8813,7 @@
                     <w:sz w:val="14"/>
                     <w:szCs w:val="14"/>
                   </w:rPr>
-                  <w:t>type here</w:t>
+                  <w:t>-</w:t>
                 </w:r>
               </w:sdtContent>
             </w:sdt>
@@ -9116,6 +9103,7 @@
           <w:b/>
           <w:sz w:val="22"/>
         </w:rPr>
+        <w:lastRenderedPageBreak/>
         <w:t>Academic Sign-off</w:t>
       </w:r>
       <w:r>
@@ -9356,7 +9344,7 @@
                     <w:sz w:val="15"/>
                     <w:szCs w:val="15"/>
                   </w:rPr>
-                  <w:t>Select ▾</w:t>
+                  <w:t>Yes</w:t>
                 </w:r>
               </w:sdtContent>
             </w:sdt>
@@ -9391,7 +9379,7 @@
                     <w:sz w:val="15"/>
                     <w:szCs w:val="15"/>
                   </w:rPr>
-                  <w:t>Select ▾</w:t>
+                  <w:t>Yes</w:t>
                 </w:r>
               </w:sdtContent>
             </w:sdt>
@@ -9405,6 +9393,64 @@
             <w:pPr>
               <w:keepNext/>
             </w:pPr>
+            <w:r>
+              <w:rPr>
+                <w:noProof/>
+              </w:rPr>
+              <w:drawing>
+                <wp:inline distT="0" distB="0" distL="0" distR="0" wp14:anchorId="4B6E3B4E" wp14:editId="072F560B">
+                  <wp:extent cx="876300" cy="580390"/>
+                  <wp:effectExtent l="0" t="0" r="0" b="0"/>
+                  <wp:docPr id="2053396929" name="Picture 2"/>
+                  <wp:cNvGraphicFramePr>
+                    <a:graphicFrameLocks xmlns:a="http://schemas.openxmlformats.org/drawingml/2006/main" noChangeAspect="1"/>
+                  </wp:cNvGraphicFramePr>
+                  <a:graphic xmlns:a="http://schemas.openxmlformats.org/drawingml/2006/main">
+                    <a:graphicData uri="http://schemas.openxmlformats.org/drawingml/2006/picture">
+                      <pic:pic xmlns:pic="http://schemas.openxmlformats.org/drawingml/2006/picture">
+                        <pic:nvPicPr>
+                          <pic:cNvPr id="0" name="Picture 2"/>
+                          <pic:cNvPicPr>
+                            <a:picLocks noChangeAspect="1" noChangeArrowheads="1"/>
+                          </pic:cNvPicPr>
+                        </pic:nvPicPr>
+                        <pic:blipFill rotWithShape="1">
+                          <a:blip r:embed="rId8">
+                            <a:extLst>
+                              <a:ext uri="{28A0092B-C50C-407E-A947-70E740481C1C}">
+                                <a14:useLocalDpi xmlns:a14="http://schemas.microsoft.com/office/drawing/2010/main" val="0"/>
+                              </a:ext>
+                            </a:extLst>
+                          </a:blip>
+                          <a:srcRect t="19760" r="-7728" b="40105"/>
+                          <a:stretch>
+                            <a:fillRect/>
+                          </a:stretch>
+                        </pic:blipFill>
+                        <pic:spPr bwMode="auto">
+                          <a:xfrm>
+                            <a:off x="0" y="0"/>
+                            <a:ext cx="887991" cy="588133"/>
+                          </a:xfrm>
+                          <a:prstGeom prst="rect">
+                            <a:avLst/>
+                          </a:prstGeom>
+                          <a:noFill/>
+                          <a:ln>
+                            <a:noFill/>
+                          </a:ln>
+                          <a:extLst>
+                            <a:ext uri="{53640926-AAD7-44D8-BBD7-CCE9431645EC}">
+                              <a14:shadowObscured xmlns:a14="http://schemas.microsoft.com/office/drawing/2010/main"/>
+                            </a:ext>
+                          </a:extLst>
+                        </pic:spPr>
+                      </pic:pic>
+                    </a:graphicData>
+                  </a:graphic>
+                </wp:inline>
+              </w:drawing>
+            </w:r>
           </w:p>
         </w:tc>
         <w:tc>
@@ -9436,7 +9482,7 @@
                     <w:sz w:val="15"/>
                     <w:szCs w:val="15"/>
                   </w:rPr>
-                  <w:t>Select ▾</w:t>
+                  <w:t>Yes</w:t>
                 </w:r>
               </w:sdtContent>
             </w:sdt>
@@ -9494,7 +9540,7 @@
                     <w:sz w:val="15"/>
                     <w:szCs w:val="15"/>
                   </w:rPr>
-                  <w:t>Select ▾</w:t>
+                  <w:t>Yes</w:t>
                 </w:r>
               </w:sdtContent>
             </w:sdt>
@@ -9529,7 +9575,7 @@
                     <w:sz w:val="15"/>
                     <w:szCs w:val="15"/>
                   </w:rPr>
-                  <w:t>Select ▾</w:t>
+                  <w:t>Yes</w:t>
                 </w:r>
               </w:sdtContent>
             </w:sdt>
@@ -9564,7 +9610,7 @@
                     <w:sz w:val="15"/>
                     <w:szCs w:val="15"/>
                   </w:rPr>
-                  <w:t>Select ▾</w:t>
+                  <w:t>Yes</w:t>
                 </w:r>
               </w:sdtContent>
             </w:sdt>
@@ -9578,6 +9624,64 @@
             <w:pPr>
               <w:keepNext/>
             </w:pPr>
+            <w:r>
+              <w:rPr>
+                <w:noProof/>
+              </w:rPr>
+              <w:drawing>
+                <wp:inline distT="0" distB="0" distL="0" distR="0" wp14:anchorId="67404347" wp14:editId="71164094">
+                  <wp:extent cx="836824" cy="481012"/>
+                  <wp:effectExtent l="0" t="0" r="1905" b="0"/>
+                  <wp:docPr id="2026480804" name="Picture 4"/>
+                  <wp:cNvGraphicFramePr>
+                    <a:graphicFrameLocks xmlns:a="http://schemas.openxmlformats.org/drawingml/2006/main" noChangeAspect="1"/>
+                  </wp:cNvGraphicFramePr>
+                  <a:graphic xmlns:a="http://schemas.openxmlformats.org/drawingml/2006/main">
+                    <a:graphicData uri="http://schemas.openxmlformats.org/drawingml/2006/picture">
+                      <pic:pic xmlns:pic="http://schemas.openxmlformats.org/drawingml/2006/picture">
+                        <pic:nvPicPr>
+                          <pic:cNvPr id="0" name="Picture 3"/>
+                          <pic:cNvPicPr>
+                            <a:picLocks noChangeAspect="1" noChangeArrowheads="1"/>
+                          </pic:cNvPicPr>
+                        </pic:nvPicPr>
+                        <pic:blipFill rotWithShape="1">
+                          <a:blip r:embed="rId9">
+                            <a:extLst>
+                              <a:ext uri="{28A0092B-C50C-407E-A947-70E740481C1C}">
+                                <a14:useLocalDpi xmlns:a14="http://schemas.microsoft.com/office/drawing/2010/main" val="0"/>
+                              </a:ext>
+                            </a:extLst>
+                          </a:blip>
+                          <a:srcRect t="33259" b="27770"/>
+                          <a:stretch>
+                            <a:fillRect/>
+                          </a:stretch>
+                        </pic:blipFill>
+                        <pic:spPr bwMode="auto">
+                          <a:xfrm>
+                            <a:off x="0" y="0"/>
+                            <a:ext cx="864878" cy="497138"/>
+                          </a:xfrm>
+                          <a:prstGeom prst="rect">
+                            <a:avLst/>
+                          </a:prstGeom>
+                          <a:noFill/>
+                          <a:ln>
+                            <a:noFill/>
+                          </a:ln>
+                          <a:extLst>
+                            <a:ext uri="{53640926-AAD7-44D8-BBD7-CCE9431645EC}">
+                              <a14:shadowObscured xmlns:a14="http://schemas.microsoft.com/office/drawing/2010/main"/>
+                            </a:ext>
+                          </a:extLst>
+                        </pic:spPr>
+                      </pic:pic>
+                    </a:graphicData>
+                  </a:graphic>
+                </wp:inline>
+              </w:drawing>
+            </w:r>
           </w:p>
         </w:tc>
         <w:tc>
@@ -9609,7 +9713,7 @@
                     <w:sz w:val="15"/>
                     <w:szCs w:val="15"/>
                   </w:rPr>
-                  <w:t>Select ▾</w:t>
+                  <w:t>Yes</w:t>
                 </w:r>
               </w:sdtContent>
             </w:sdt>
@@ -9661,7 +9765,7 @@
                     <w:sz w:val="15"/>
                     <w:szCs w:val="15"/>
                   </w:rPr>
-                  <w:t>Select ▾</w:t>
+                  <w:t>Yes</w:t>
                 </w:r>
               </w:sdtContent>
             </w:sdt>
@@ -9693,7 +9797,7 @@
                     <w:sz w:val="15"/>
                     <w:szCs w:val="15"/>
                   </w:rPr>
-                  <w:t>Select ▾</w:t>
+                  <w:t>Yes</w:t>
                 </w:r>
               </w:sdtContent>
             </w:sdt>
@@ -9725,7 +9829,7 @@
                     <w:sz w:val="15"/>
                     <w:szCs w:val="15"/>
                   </w:rPr>
-                  <w:t>Select ▾</w:t>
+                  <w:t>Yes</w:t>
                 </w:r>
               </w:sdtContent>
             </w:sdt>
@@ -9735,7 +9839,45 @@
           <w:tcPr>
             <w:tcW w:w="2211" w:type="dxa"/>
           </w:tcPr>
-          <w:p/>
+          <w:p>
+            <w:r>
+              <w:drawing>
+                <wp:inline distT="0" distB="0" distL="0" distR="0" wp14:anchorId="46B89954" wp14:editId="2777DA4F">
+                  <wp:extent cx="1039298" cy="738188"/>
+                  <wp:effectExtent l="0" t="0" r="8890" b="5080"/>
+                  <wp:docPr id="985502348" name="Picture 1"/>
+                  <wp:cNvGraphicFramePr>
+                    <a:graphicFrameLocks xmlns:a="http://schemas.openxmlformats.org/drawingml/2006/main" noChangeAspect="1"/>
+                  </wp:cNvGraphicFramePr>
+                  <a:graphic xmlns:a="http://schemas.openxmlformats.org/drawingml/2006/main">
+                    <a:graphicData uri="http://schemas.openxmlformats.org/drawingml/2006/picture">
+                      <pic:pic xmlns:pic="http://schemas.openxmlformats.org/drawingml/2006/picture">
+                        <pic:nvPicPr>
+                          <pic:cNvPr id="985502348" name=""/>
+                          <pic:cNvPicPr/>
+                        </pic:nvPicPr>
+                        <pic:blipFill>
+                          <a:blip r:embed="rId10"/>
+                          <a:stretch>
+                            <a:fillRect/>
+                          </a:stretch>
+                        </pic:blipFill>
+                        <pic:spPr>
+                          <a:xfrm>
+                            <a:off x="0" y="0"/>
+                            <a:ext cx="1049628" cy="745525"/>
+                          </a:xfrm>
+                          <a:prstGeom prst="rect">
+                            <a:avLst/>
+                          </a:prstGeom>
+                        </pic:spPr>
+                      </pic:pic>
+                    </a:graphicData>
+                  </a:graphic>
+                </wp:inline>
+              </w:drawing>
+            </w:r>
+          </w:p>
         </w:tc>
         <w:tc>
           <w:tcPr>
@@ -9763,7 +9905,7 @@
                     <w:sz w:val="15"/>
                     <w:szCs w:val="15"/>
                   </w:rPr>
-                  <w:t>Select ▾</w:t>
+                  <w:t>Yes</w:t>
                 </w:r>
               </w:sdtContent>
             </w:sdt>
@@ -9786,7 +9928,7 @@
       </w:r>
     </w:p>
     <w:sectPr>
-      <w:footerReference w:type="default" r:id="rId8"/>
+      <w:footerReference w:type="default" r:id="rId11"/>
       <w:pgSz w:w="11906" w:h="16838"/>
       <w:pgMar w:top="850" w:right="850" w:bottom="850" w:left="850" w:header="720" w:footer="720" w:gutter="0"/>
       <w:cols w:space="720"/>
@@ -10675,7 +10817,6 @@
   <w:style w:type="character" w:default="1" w:styleId="DefaultParagraphFont">
     <w:name w:val="Default Paragraph Font"/>
     <w:uiPriority w:val="1"/>
-    <w:semiHidden/>
     <w:unhideWhenUsed/>
   </w:style>
   <w:style w:type="table" w:default="1" w:styleId="TableNormal">
@@ -21451,6 +21592,29 @@
       </w:tcPr>
     </w:tblStylePr>
   </w:style>
+  <w:style w:type="character" w:styleId="Hyperlink">
+    <w:name w:val="Hyperlink"/>
+    <w:basedOn w:val="DefaultParagraphFont"/>
+    <w:uiPriority w:val="99"/>
+    <w:unhideWhenUsed/>
+    <w:rsid w:val="00EA18CB"/>
+    <w:rPr>
+      <w:color w:val="0000FF" w:themeColor="hyperlink"/>
+      <w:u w:val="single"/>
+    </w:rPr>
+  </w:style>
+  <w:style w:type="character" w:styleId="UnresolvedMention">
+    <w:name w:val="Unresolved Mention"/>
+    <w:basedOn w:val="DefaultParagraphFont"/>
+    <w:uiPriority w:val="99"/>
+    <w:semiHidden/>
+    <w:unhideWhenUsed/>
+    <w:rsid w:val="00EA18CB"/>
+    <w:rPr>
+      <w:color w:val="605E5C"/>
+      <w:shd w:val="clear" w:color="auto" w:fill="E1DFDD"/>
+    </w:rPr>
+  </w:style>
 </w:styles>
 </file>
 

</xml_diff>

<commit_message>
docs: update technical dossier
</commit_message>
<xml_diff>
--- a/Group_10_Devraj_Aaryesh_Jiya/docs/IVRAR_Group_10_Technical_Dossier.docx
+++ b/Group_10_Devraj_Aaryesh_Jiya/docs/IVRAR_Group_10_Technical_Dossier.docx
@@ -3501,7 +3501,23 @@
                     <w:sz w:val="15"/>
                     <w:szCs w:val="15"/>
                   </w:rPr>
-                  <w:t>origin/feat/r045-final-submission  origin/feat/r045-xr-systems-architect</w:t>
+                  <w:t>origin/feat/r045-final-</w:t>
+                </w:r>
+                <w:proofErr w:type="gramStart"/>
+                <w:r>
+                  <w:rPr>
+                    <w:sz w:val="15"/>
+                    <w:szCs w:val="15"/>
+                  </w:rPr>
+                  <w:t>submission  origin</w:t>
+                </w:r>
+                <w:proofErr w:type="gramEnd"/>
+                <w:r>
+                  <w:rPr>
+                    <w:sz w:val="15"/>
+                    <w:szCs w:val="15"/>
+                  </w:rPr>
+                  <w:t>/feat/r045-xr-systems-architect</w:t>
                 </w:r>
               </w:sdtContent>
             </w:sdt>
@@ -3772,7 +3788,7 @@
                     <w:sz w:val="15"/>
                     <w:szCs w:val="15"/>
                   </w:rPr>
-                  <w:t>SIMULATED_hand_tracking_benchmark.csvSIMULATED_sample_experiment_data.csv</w:t>
+                  <w:t>0</w:t>
                 </w:r>
               </w:sdtContent>
             </w:sdt>
@@ -4235,6 +4251,7 @@
                 <w:text/>
               </w:sdtPr>
               <w:sdtContent>
+                <w:proofErr w:type="spellStart"/>
                 <w:r>
                   <w:rPr>
                     <w:sz w:val="15"/>
@@ -4242,6 +4259,7 @@
                   </w:rPr>
                   <w:t>JiyaSaxena</w:t>
                 </w:r>
+                <w:proofErr w:type="spellEnd"/>
               </w:sdtContent>
             </w:sdt>
           </w:p>
@@ -5769,7 +5787,6 @@
           <w:b/>
           <w:sz w:val="22"/>
         </w:rPr>
-        <w:lastRenderedPageBreak/>
         <w:t>SECTION 5 · LinkedIn Video Showcase, AI Verification Audit &amp; Peer Review</w:t>
       </w:r>
       <w:r>
@@ -8636,7 +8653,23 @@
                     <w:sz w:val="14"/>
                     <w:szCs w:val="14"/>
                   </w:rPr>
-                  <w:t>How a webcam hand-tracking pipeline works end to end, from MediaPipe landmarks to streaming over UDP into Unity.</w:t>
+                  <w:t xml:space="preserve">How a webcam hand-tracking pipeline works end to end, from </w:t>
+                </w:r>
+                <w:proofErr w:type="spellStart"/>
+                <w:r>
+                  <w:rPr>
+                    <w:sz w:val="14"/>
+                    <w:szCs w:val="14"/>
+                  </w:rPr>
+                  <w:t>MediaPipe</w:t>
+                </w:r>
+                <w:proofErr w:type="spellEnd"/>
+                <w:r>
+                  <w:rPr>
+                    <w:sz w:val="14"/>
+                    <w:szCs w:val="14"/>
+                  </w:rPr>
+                  <w:t xml:space="preserve"> landmarks to streaming over UDP into Unity.</w:t>
                 </w:r>
               </w:sdtContent>
             </w:sdt>
@@ -8785,7 +8818,15 @@
               </w:sdtPr>
               <w:sdtContent>
                 <w:r>
-                  <w:t>Reliable gesture recognition depends on normalised thresholds and debouncing, not just detecting a pose once.</w:t>
+                  <w:t xml:space="preserve">Reliable gesture recognition depends on </w:t>
+                </w:r>
+                <w:proofErr w:type="spellStart"/>
+                <w:r>
+                  <w:t>normalised</w:t>
+                </w:r>
+                <w:proofErr w:type="spellEnd"/>
+                <w:r>
+                  <w:t xml:space="preserve"> thresholds and debouncing, not just detecting a pose once.</w:t>
                 </w:r>
               </w:sdtContent>
             </w:sdt>

</xml_diff>